<commit_message>
Registrar cribado y auditoría provisional con 23 casos C0 pendientes
</commit_message>
<xml_diff>
--- a/TRABAJO GRUPAL/doc-borrador/Esqueleto_Paper_EPP_YOLO26.docx
+++ b/TRABAJO GRUPAL/doc-borrador/Esqueleto_Paper_EPP_YOLO26.docx
@@ -330,21 +330,47 @@
     </w:p>
     <w:p>
       <w:pPr>
-        <w:shd w:val="clear" w:fill="F2F2F2"/>
         <w:jc w:val="center"/>
-        <w:rPr>
-          <w:rFonts w:hint="default" w:ascii="Times New Roman" w:hAnsi="Times New Roman" w:cs="Times New Roman"/>
-          <w:color w:val="auto"/>
-        </w:rPr>
       </w:pPr>
       <w:r>
-        <w:rPr>
-          <w:rFonts w:hint="default" w:ascii="Times New Roman" w:hAnsi="Times New Roman" w:cs="Times New Roman"/>
-          <w:b/>
-          <w:color w:val="auto"/>
-          <w:sz w:val="18"/>
-        </w:rPr>
-        <w:t>[ Figura 1 — Diagrama de flujo PRISMA 2020 — usar la plantilla new_SRs_v2 ]</w:t>
+        <w:drawing>
+          <wp:inline distT="0" distB="0" distL="114300" distR="114300">
+            <wp:extent cx="5757545" cy="5709565"/>
+            <wp:effectExtent l="0" t="0" r="0" b="0"/>
+            <wp:docPr id="100" name="Figura 1"/>
+            <wp:cNvGraphicFramePr>
+              <a:graphicFrameLocks xmlns:a="http://schemas.openxmlformats.org/drawingml/2006/main" noChangeAspect="1"/>
+            </wp:cNvGraphicFramePr>
+            <a:graphic xmlns:a="http://schemas.openxmlformats.org/drawingml/2006/main">
+              <a:graphicData uri="http://schemas.openxmlformats.org/drawingml/2006/picture">
+                <pic:pic xmlns:pic="http://schemas.openxmlformats.org/drawingml/2006/picture">
+                  <pic:nvPicPr>
+                    <pic:cNvPr id="100" name="Figura 1"/>
+                    <pic:cNvPicPr>
+                      <a:picLocks noChangeAspect="1"/>
+                    </pic:cNvPicPr>
+                  </pic:nvPicPr>
+                  <pic:blipFill>
+                    <a:blip r:embed="rId13"/>
+                    <a:stretch>
+                      <a:fillRect/>
+                    </a:stretch>
+                  </pic:blipFill>
+                  <pic:spPr>
+                    <a:xfrm>
+                      <a:off x="0" y="0"/>
+                      <a:ext cx="5757545" cy="5709565"/>
+                    </a:xfrm>
+                    <a:prstGeom prst="rect">
+                      <a:avLst/>
+                    </a:prstGeom>
+                    <a:noFill/>
+                  </pic:spPr>
+                </pic:pic>
+              </a:graphicData>
+            </a:graphic>
+          </wp:inline>
+        </w:drawing>
       </w:r>
     </w:p>
     <w:p>
@@ -362,7 +388,7 @@
           <w:color w:val="auto"/>
           <w:sz w:val="18"/>
         </w:rPr>
-        <w:t>Figura 1. [pie: describir qué muestra]</w:t>
+        <w:t>Figura 1. Flujo auditado de selección documental del corpus cerrado (n = 57). Los registros no recuperados se cuentan en recuperación; C0 señala cierre administrativo y los estudios de contexto no se suman.</w:t>
       </w:r>
     </w:p>
     <w:p>
@@ -795,29 +821,7 @@
                 <w:szCs w:val="18"/>
               </w:rPr>
               <w:t>Imágenes </w:t>
-            </w:r>
-            <w:r>
-              <w:rPr>
-                <w:rStyle w:val="34"/>
-                <w:rFonts w:hint="default" w:ascii="Times New Roman" w:hAnsi="Times New Roman" w:cs="Times New Roman"/>
-                <w:b/>
-                <w:bCs w:val="0"/>
-                <w:color w:val="auto"/>
-                <w:sz w:val="18"/>
-                <w:szCs w:val="18"/>
-              </w:rPr>
               <w:br w:type="textWrapping"/>
-            </w:r>
-            <w:r>
-              <w:rPr>
-                <w:rStyle w:val="34"/>
-                <w:rFonts w:hint="default" w:ascii="Times New Roman" w:hAnsi="Times New Roman" w:cs="Times New Roman"/>
-                <w:b/>
-                <w:bCs w:val="0"/>
-                <w:color w:val="auto"/>
-                <w:sz w:val="18"/>
-                <w:szCs w:val="18"/>
-              </w:rPr>
               <w:t>empleadas</w:t>
             </w:r>
           </w:p>

</xml_diff>